<commit_message>
feat(clm): dynamic docx parsing, progressive disclosure UX, live BigQuery 3-deal portfolio & dynamic HTML generation
</commit_message>
<xml_diff>
--- a/BA-2026-LG-7740_Working_Review.docx
+++ b/BA-2026-LG-7740_Working_Review.docx
@@ -12,12 +12,13 @@
     </w:p>
     <w:p>
       <w:r>
-        <w:t>Deal ID: BA-2026-LG-7740 | Supplier: Meridian Landing Gear Corp. (Tier-1 Structural &amp; Landing Gear) | Program: 787-10 Titanium Main Landing Gear Assemblies (TLG-800) | Value: $52,000,000.00 (Firm-Fixed-Price (FFP) — $45,000,000 Ceiling) | Status: IN_SME_REVIEW | Generated UTC: 2026-10-22T00:15:42Z</w:t>
+        <w:t>Deal ID: BA-2026-LG-7740 | Supplier: Meridian Landing Gear Corp. (Tier-1 Structural &amp; Landing Gear) | Program: 787-10 Titanium Main Landing Gear Assemblies (TLG-800) | Value: $52,000,000.00 (Firm-Fixed-Price (FFP) — $52,000,000 Ceiling) | Status: IN_SME_REVIEW | Generated UTC: 2026-10-28T04:08:26Z</w:t>
       </w:r>
     </w:p>
     <w:tbl>
       <w:tblPr>
         <w:tblW w:type="auto" w:w="0"/>
+        <w:tblLayout w:type="fixed"/>
         <w:tblLook w:firstColumn="1" w:firstRow="1" w:lastColumn="0" w:lastRow="0" w:noHBand="0" w:noVBand="1" w:val="04A0"/>
       </w:tblPr>
       <w:tblGrid>
@@ -27,7 +28,7 @@
       <w:tr>
         <w:tc>
           <w:tcPr>
-            <w:tcW w:type="dxa" w:w="4320"/>
+            <w:tcW w:type="dxa" w:w="3312"/>
           </w:tcPr>
           <w:p>
             <w:r>
@@ -37,7 +38,7 @@
         </w:tc>
         <w:tc>
           <w:tcPr>
-            <w:tcW w:type="dxa" w:w="4320"/>
+            <w:tcW w:type="dxa" w:w="6048"/>
           </w:tcPr>
           <w:p>
             <w:r>
@@ -49,7 +50,7 @@
       <w:tr>
         <w:tc>
           <w:tcPr>
-            <w:tcW w:type="dxa" w:w="4320"/>
+            <w:tcW w:type="dxa" w:w="3312"/>
           </w:tcPr>
           <w:p>
             <w:r>
@@ -59,7 +60,7 @@
         </w:tc>
         <w:tc>
           <w:tcPr>
-            <w:tcW w:type="dxa" w:w="4320"/>
+            <w:tcW w:type="dxa" w:w="6048"/>
           </w:tcPr>
           <w:p>
             <w:r>
@@ -71,7 +72,7 @@
       <w:tr>
         <w:tc>
           <w:tcPr>
-            <w:tcW w:type="dxa" w:w="4320"/>
+            <w:tcW w:type="dxa" w:w="3312"/>
           </w:tcPr>
           <w:p>
             <w:r>
@@ -81,7 +82,7 @@
         </w:tc>
         <w:tc>
           <w:tcPr>
-            <w:tcW w:type="dxa" w:w="4320"/>
+            <w:tcW w:type="dxa" w:w="6048"/>
           </w:tcPr>
           <w:p>
             <w:r>
@@ -93,7 +94,7 @@
       <w:tr>
         <w:tc>
           <w:tcPr>
-            <w:tcW w:type="dxa" w:w="4320"/>
+            <w:tcW w:type="dxa" w:w="3312"/>
           </w:tcPr>
           <w:p>
             <w:r>
@@ -103,7 +104,7 @@
         </w:tc>
         <w:tc>
           <w:tcPr>
-            <w:tcW w:type="dxa" w:w="4320"/>
+            <w:tcW w:type="dxa" w:w="6048"/>
           </w:tcPr>
           <w:p>
             <w:r>
@@ -115,7 +116,7 @@
       <w:tr>
         <w:tc>
           <w:tcPr>
-            <w:tcW w:type="dxa" w:w="4320"/>
+            <w:tcW w:type="dxa" w:w="3312"/>
           </w:tcPr>
           <w:p>
             <w:r>
@@ -125,7 +126,7 @@
         </w:tc>
         <w:tc>
           <w:tcPr>
-            <w:tcW w:type="dxa" w:w="4320"/>
+            <w:tcW w:type="dxa" w:w="6048"/>
           </w:tcPr>
           <w:p>
             <w:r>
@@ -137,7 +138,7 @@
       <w:tr>
         <w:tc>
           <w:tcPr>
-            <w:tcW w:type="dxa" w:w="4320"/>
+            <w:tcW w:type="dxa" w:w="3312"/>
           </w:tcPr>
           <w:p>
             <w:r>
@@ -147,7 +148,7 @@
         </w:tc>
         <w:tc>
           <w:tcPr>
-            <w:tcW w:type="dxa" w:w="4320"/>
+            <w:tcW w:type="dxa" w:w="6048"/>
           </w:tcPr>
           <w:p>
             <w:r>
@@ -159,7 +160,7 @@
       <w:tr>
         <w:tc>
           <w:tcPr>
-            <w:tcW w:type="dxa" w:w="4320"/>
+            <w:tcW w:type="dxa" w:w="3312"/>
           </w:tcPr>
           <w:p>
             <w:r>
@@ -169,11 +170,11 @@
         </w:tc>
         <w:tc>
           <w:tcPr>
-            <w:tcW w:type="dxa" w:w="4320"/>
+            <w:tcW w:type="dxa" w:w="6048"/>
           </w:tcPr>
           <w:p>
             <w:r>
-              <w:t>Firm-Fixed-Price (FFP) — $45,000,000 Ceiling (GP1 §3.1)</w:t>
+              <w:t>Firm-Fixed-Price (FFP) — $52,000,000 Ceiling (GP1 §3.1)</w:t>
             </w:r>
           </w:p>
         </w:tc>
@@ -181,7 +182,7 @@
       <w:tr>
         <w:tc>
           <w:tcPr>
-            <w:tcW w:type="dxa" w:w="4320"/>
+            <w:tcW w:type="dxa" w:w="3312"/>
           </w:tcPr>
           <w:p>
             <w:r>
@@ -191,7 +192,7 @@
         </w:tc>
         <w:tc>
           <w:tcPr>
-            <w:tcW w:type="dxa" w:w="4320"/>
+            <w:tcW w:type="dxa" w:w="6048"/>
           </w:tcPr>
           <w:p>
             <w:r>
@@ -203,7 +204,7 @@
       <w:tr>
         <w:tc>
           <w:tcPr>
-            <w:tcW w:type="dxa" w:w="4320"/>
+            <w:tcW w:type="dxa" w:w="3312"/>
           </w:tcPr>
           <w:p>
             <w:r>
@@ -213,7 +214,7 @@
         </w:tc>
         <w:tc>
           <w:tcPr>
-            <w:tcW w:type="dxa" w:w="4320"/>
+            <w:tcW w:type="dxa" w:w="6048"/>
           </w:tcPr>
           <w:p>
             <w:r>
@@ -225,7 +226,7 @@
       <w:tr>
         <w:tc>
           <w:tcPr>
-            <w:tcW w:type="dxa" w:w="4320"/>
+            <w:tcW w:type="dxa" w:w="3312"/>
           </w:tcPr>
           <w:p>
             <w:r>
@@ -235,7 +236,7 @@
         </w:tc>
         <w:tc>
           <w:tcPr>
-            <w:tcW w:type="dxa" w:w="4320"/>
+            <w:tcW w:type="dxa" w:w="6048"/>
           </w:tcPr>
           <w:p>
             <w:r>
@@ -247,7 +248,7 @@
       <w:tr>
         <w:tc>
           <w:tcPr>
-            <w:tcW w:type="dxa" w:w="4320"/>
+            <w:tcW w:type="dxa" w:w="3312"/>
           </w:tcPr>
           <w:p>
             <w:r>
@@ -257,7 +258,7 @@
         </w:tc>
         <w:tc>
           <w:tcPr>
-            <w:tcW w:type="dxa" w:w="4320"/>
+            <w:tcW w:type="dxa" w:w="6048"/>
           </w:tcPr>
           <w:p>
             <w:r>
@@ -269,7 +270,7 @@
       <w:tr>
         <w:tc>
           <w:tcPr>
-            <w:tcW w:type="dxa" w:w="4320"/>
+            <w:tcW w:type="dxa" w:w="3312"/>
           </w:tcPr>
           <w:p>
             <w:r>
@@ -279,11 +280,11 @@
         </w:tc>
         <w:tc>
           <w:tcPr>
-            <w:tcW w:type="dxa" w:w="4320"/>
+            <w:tcW w:type="dxa" w:w="6048"/>
           </w:tcPr>
           <w:p>
             <w:r>
-              <w:t>2026-10-22T00:15:42Z</w:t>
+              <w:t>2026-10-28T04:08:26Z</w:t>
             </w:r>
           </w:p>
         </w:tc>
@@ -299,7 +300,7 @@
     </w:p>
     <w:p>
       <w:r>
-        <w:t xml:space="preserve">1.1 (a) Definitions: "Buyer" means Cymbal Aerospace Corporation or its wholly-owned aerospace subsidiary identified on the face of the Master Purchase Agreement (`BA-2026-AV-8921`). "Seller" means Apex AeroSystems Inc. or the legal entity furnishing Goods and flight-critical software hereunder. "Goods" means the Triple-Redundant Fly-By-Wire Flight Control Computers (`FCC-900`), Line Replaceable Units (`LRUs`), embedded DAL-A flight control firmware, and associated technical deliverables specified in Statement of Work (`SOW-AV-8921`) Schedule A. (b) Order of Precedence: In the event of any ambiguity or inconsistency among Contract documents, Special Provisions (`SP3` International &amp; Tariff Provisions and `SP5` Cybersecurity &amp; Defense Provisions) shall take precedence over these General Provisions (`GP1`), expressly excluding the Firm-Fixed-Price (`FFP`) unit price locks and $45,000,000 aggregate ceiling set forth in GP1 §3.1 and SOW Schedule A, which shall govern over any conflicting Special Provision unless modified by a formal bilateral Change Order.</w:t>
+        <w:t xml:space="preserve">1.1 Buyer means Cymbal Aerospace Corporation. Seller means Meridian Landing Gear Corp. supplying 787-10 Titanium Main Landing Gear Assemblies (TLG-800). In the event of any inconsistency among Contract documents, Special Provisions (SP) shall take precedence over General Provisions (GP1), excluding Firm-Fixed-Price caps set forth in GP1 §3.1.</w:t>
       </w:r>
     </w:p>
     <w:p>
@@ -312,7 +313,7 @@
     </w:p>
     <w:p>
       <w:r>
-        <w:t xml:space="preserve">3.1 (a) Firm-Fixed-Price Lock: Unless expressly modified by a bilateral Change Order executed by Buyer's Vice President of Avionics Procurement referencing this GP1 §3.1 and Statement of Work (`SOW-AV-8921`) Schedule A, all unit prices ($150,000 per shipset across 300 C780/C730-MAX shipsets) and the forty-five million dollar ($45,000,000.00) total Contract ceiling are strictly Firm-Fixed-Price (`FFP`) and shall not be subject to uncapped surcharges, tariff pass-throughs, customs duty adjustments, foreign exchange fluctuations, or raw material commodity indexing. (b) Invoicing &amp; Payment Integrity: Seller shall submit itemized electronic invoices upon DDP acceptance of each production lot at Buyer's Everett or Renton final assembly line, payable Net Sixty (60) days. Any unilateral invoice surcharge not authorized by an executed GP1 §3.1 Change Order shall be automatically rejected.</w:t>
+        <w:t xml:space="preserve">3.1 Unless expressly modified by a bilateral Change Order signed by Buyer's Authorized Procurement Representative referencing this GP1 §3.1, all TLG-800 Titanium Main Landing Gear unit prices in Statement of Work (SOW) Schedule A are Firm-Fixed-Price ($52,000,000 ceiling) and shall not be subject to uncapped surcharges, tariff pass-throughs, or raw material indexing.</w:t>
       </w:r>
     </w:p>
     <w:p>
@@ -325,7 +326,7 @@
     </w:p>
     <w:p>
       <w:r>
-        <w:t xml:space="preserve">5.2 (a) Flight-Critical Avionics Preservation: Seller shall clean, preserve, pack, mark, and ship all `FCC-900` Flight Control Computer LRUs in strict accordance with Cymbal Aerospace Supplier Packaging Specification `D6-81628` and Air Transport Association (`ATA`) Spec 300 Category I reusable container and MIL-STD-1686 Class 1 electro-static discharge (`ESD`) protection standards. (b) Traceability &amp; Barcoding: Each individual LRU chassis and exterior shipping container shall bear permanent UID/GS1-128 serialized barcoding, shock-watch and tilt-indicator telemetry seals, desiccant humidity indicators, and an enclosed FAA Form 8130-3 Authorized Release Certificate. Any shipment arriving with tripped shock indicators or breached ESD shielding shall be rejected at Seller's sole expense.</w:t>
+        <w:t xml:space="preserve">5.2 Seller shall pack, mark, and ship all TLG-800 Ti-10V-2Fe-3Al main landing gear shock struts and truck beams in accordance with Cymbal Document D6-81628 and ATA Spec 300 heavy structural cradle preservation standards.</w:t>
       </w:r>
     </w:p>
     <w:p>
@@ -338,7 +339,7 @@
     </w:p>
     <w:p>
       <w:r>
-        <w:t xml:space="preserve">7.1 (a) Accredited Aerospace QMS: Seller shall establish and maintain an IAQG-accredited `AS9100 Rev D` Quality Management System, `RTCA DO-178C` Design Assurance Level A (`DAL-A`) software lifecycle compliance, `RTCA DO-254` complex electronic hardware assurance, and Cymbal Aerospace Quality Management System Requirements for Suppliers (`D6-82479`) throughout Contract performance. (b) First Article Inspection &amp; Sub-Tier Flowdown: Prior to initial production lot delivery, Seller shall complete a full `AS9102` First Article Inspection Report (`FAIR`) witnessed by Buyer's Supplier Quality Representative and shall flow down identical AS9100 Rev D and counterfeit electronic part avoidance (`AS5553`) controls to all sub-tier wafer foundries and forging sub-contractors.</w:t>
+        <w:t xml:space="preserve">7.1 Seller shall maintain an accredited AS9100 Rev D and Nadcap Non-Destructive Testing (Ultrasonic &amp; Eddy Current) Quality Management System for all TLG-800 titanium forgings and comply with D6-82479 throughout Contract performance.</w:t>
       </w:r>
     </w:p>
     <w:p>
@@ -351,7 +352,7 @@
     </w:p>
     <w:p>
       <w:r>
-        <w:t xml:space="preserve">9.1 (a) Directed Engineering &amp; Schedule Changes: Buyer's Authorized Procurement Representative may at any time, by written Change Order without notice to sureties, direct changes within the general scope of this Contract in (i) drawings, avionics bus interface control documents (`ICDs`), or technical specifications, (ii) method of shipment or aerospace preservation, or (iii) place and schedule of delivery. Seller shall proceed immediately with performance of the Contract as changed. (b) Equitable Adjustment Claims: If any directed change under §9.1(a) causes a verified increase or decrease in the cost of or time required for performance, Seller must assert any claim for equitable adjustment in writing within thirty (30) calendar days from receipt of the written Change Order, supported by certified cost and pricing data.</w:t>
+        <w:t xml:space="preserve">9.1 Buyer's Authorized Procurement Representative may at any time, by written order, direct changes within the general scope of this Contract in TLG-800 landing gear trunnion drawings, forging specifications, or delivery schedules.</w:t>
       </w:r>
     </w:p>
     <w:p>
@@ -365,10 +366,13 @@
     <w:p>
       <w:commentRangeStart w:id="1"/>
       <w:r>
-        <w:t xml:space="preserve">12.2 (a) Airworthiness &amp; Hardware/Firmware Warranty: Seller warrants all Goods, including FCC-900 flight control hardware, triplex voting channels, and embedded DO-178C DAL-A avionics firmware, to be free from defects in design, material, and workmanship for thirty-six (36) months from initial aircraft delivery to Cymbal Aerospace's airline customer, and Seller shall repair or replace defective flight-critical LRUs on an Aircraft-on-Ground (AOG) 24-hour turnaround basis at Seller's expense. (b) Regulatory Source Surveillance: Cymbal Aerospace and Federal Aviation Administration (FAA) representatives may conduct unannounced source inspections at Seller's facility at any time to verify AS9100 Rev D quality compliance, FAA 14 CFR Part 21.140 production certificate airworthiness conformity, and sub-tier test bench calibration records.</w:t>
+        <w:t xml:space="preserve">12.2 Seller warrants all TLG-800 Titanium Main Landing Gear Assemblies against structural fatigue, forging inclusions, and defects in workmanship for thirty-six (36) months from initial aircraft delivery to Buyer's airline customer. Buyer and FAA representatives may conduct unannounced source inspections at Seller's forge and machining facilities at any time to verify AS9100 Rev D and FAA 14 CFR Part 21.140 primary structural airworthiness compliance.</w:t>
       </w:r>
       <w:commentRangeEnd w:id="1"/>
       <w:r>
+        <w:rPr>
+          <w:rStyle w:val="CommentReference"/>
+        </w:rPr>
         <w:commentReference w:id="1"/>
       </w:r>
     </w:p>
@@ -382,7 +386,7 @@
     </w:p>
     <w:p>
       <w:r>
-        <w:t xml:space="preserve">15.1 (a) Unilateral Right to Terminate: Buyer may terminate all or any severable portion of this Contract for convenience at any time by written notice of termination to Seller. Upon receipt of such notice, Seller shall immediately stop all terminated work, place no further sub-tier purchase orders for raw materials or semiconductors, and protect all property in which Buyer has or may acquire an interest. (b) Termination Settlement &amp; Cap: Seller's sole recovery upon termination for convenience, aligned with `FAR 52.249-2` principles, shall be limited to documented actual costs incurred for work-in-process prior to termination notice plus a reasonable profit on completed work, never to exceed the terminated portion of the GP1 §3.1 Firm-Fixed-Price Contract value, with zero recovery for anticipatory or consequential profits.</w:t>
+        <w:t xml:space="preserve">15.1 Buyer may terminate all or any part of this TLG-800 Contract for convenience by written notice to Seller. Seller shall immediately stop all terminated work and mitigate termination settlement costs.</w:t>
       </w:r>
     </w:p>
     <w:p>
@@ -390,23 +394,97 @@
         <w:pStyle w:val="Heading2"/>
       </w:pPr>
       <w:r>
-        <w:t>GP1 §19 &amp; §24 — Limitation of Liability &amp; IP Indemnity [⏳ PENDING REVIEW]</w:t>
+        <w:t>GP1 §19 &amp; §24 — Limitation of Liability &amp; IP Indemnity [PENDING REVIEW — Miriam Graham]</w:t>
       </w:r>
     </w:p>
     <w:p>
       <w:commentRangeStart w:id="2"/>
-      <w:del w:id="201" w:author="Miriam Graham" w:date="2026-10-22T00:15:42Z">
+      <w:r>
+        <w:t xml:space="preserve">19.1 Seller's </w:t>
+      </w:r>
+      <w:ins w:id="201" w:author="Miriam Graham" w:date="2026-10-28T04:08:26Z">
         <w:r>
-          <w:delText xml:space="preserve">19.1 (a) Direct, Line-Stoppage &amp; Airworthiness Recall Liability: Seller's aggregate liability to Cymbal Aerospace for direct damages, Everett/Renton final assembly line-stoppage costs, Fleet Airworthiness Directive (`AD`) grounding/retrofit campaigns, and airworthiness recall costs shall not exceed one hundred percent (100%) of the total Purchase Order value ($45M). 24.1 (b) Intellectual Property Indemnification: Seller shall defend, indemnify, and hold harmless Cymbal Aerospace and its airline customers against all third-party patent, copyright, trade secret, and intellectual property infringement claims arising from the manufacture, sale, or use of the Goods except where such claim arises from combination of Goods with any Cymbal Aerospace or third-party flight control bus, and if any `FCC-900` unit is enjoined, Seller shall at its sole expense procure a perpetual royalty-free license or re-architect the infringing avionics module to maintain FAA type-design airworthiness.</w:delText>
+          <w:t xml:space="preserve">aggregate </w:t>
+        </w:r>
+      </w:ins>
+      <w:r>
+        <w:t xml:space="preserve">liability for </w:t>
+      </w:r>
+      <w:ins w:id="202" w:author="Miriam Graham" w:date="2026-10-28T04:08:26Z">
+        <w:r>
+          <w:t xml:space="preserve">general </w:t>
+        </w:r>
+      </w:ins>
+      <w:r>
+        <w:t xml:space="preserve">direct </w:t>
+      </w:r>
+      <w:del w:id="203" w:author="Miriam Graham" w:date="2026-10-28T04:08:26Z">
+        <w:r>
+          <w:delText xml:space="preserve">damages, final assembly line-stoppage, and TLG-800 landing gear Airworthiness Directive recall costs </w:delText>
         </w:r>
       </w:del>
-      <w:ins w:id="202" w:author="Miriam Graham" w:date="2026-10-22T00:15:42Z">
+      <w:ins w:id="204" w:author="Miriam Graham" w:date="2026-10-28T04:08:26Z">
         <w:r>
-          <w:t xml:space="preserve">19.1 Seller's aggregate liability for general direct commercial damages arising out of or related to this Contract shall not exceed two hundred percent (200% / 2.0x) of the total Purchase Order value ($104,000,000), or 1.5x ($78,000,000) with a 2.5x ($130,000,000) Super-Cap, excluding (a) breaches of confidentiality or DFARS cybersecurity obligations, (b) gross negligence or willful misconduct, (c) Airworthiness Directive (AD) or flight-safety recall costs, and (d) Seller's Section 24 intellectual property indemnification obligations (for which liability remains uncapped).</w:t>
+          <w:t xml:space="preserve">commercial damages arising out of or related to this Contract </w:t>
+        </w:r>
+      </w:ins>
+      <w:r>
+        <w:t xml:space="preserve">shall not exceed </w:t>
+      </w:r>
+      <w:del w:id="205" w:author="Miriam Graham" w:date="2026-10-28T04:08:26Z">
+        <w:r>
+          <w:delText xml:space="preserve">one </w:delText>
+        </w:r>
+      </w:del>
+      <w:ins w:id="206" w:author="Miriam Graham" w:date="2026-10-28T04:08:26Z">
+        <w:r>
+          <w:t xml:space="preserve">two </w:t>
+        </w:r>
+      </w:ins>
+      <w:r>
+        <w:t xml:space="preserve">hundred percent </w:t>
+      </w:r>
+      <w:del w:id="207" w:author="Miriam Graham" w:date="2026-10-28T04:08:26Z">
+        <w:r>
+          <w:delText xml:space="preserve">(100%) </w:delText>
+        </w:r>
+      </w:del>
+      <w:ins w:id="208" w:author="Miriam Graham" w:date="2026-10-28T04:08:26Z">
+        <w:r>
+          <w:t xml:space="preserve">(200% / 2.0x) </w:t>
+        </w:r>
+      </w:ins>
+      <w:r>
+        <w:t xml:space="preserve">of the total Purchase Order value </w:t>
+      </w:r>
+      <w:del w:id="209" w:author="Miriam Graham" w:date="2026-10-28T04:08:26Z">
+        <w:r>
+          <w:delText xml:space="preserve">($52,000,000). 24.1 Seller shall indemnify Buyer against all third-party </w:delText>
+        </w:r>
+      </w:del>
+      <w:ins w:id="210" w:author="Miriam Graham" w:date="2026-10-28T04:08:26Z">
+        <w:r>
+          <w:t xml:space="preserve">($104,000,000), with a two hundred fifty percent (250% / 2.5x) ($130,000,000) Super-Cap, excluding (a) breaches of confidentiality or DFARS cybersecurity obligations, (b) gross negligence or willful misconduct, (c) Airworthiness Directive (AD) or flight-safety recall costs, and (d) Seller's Section 24 </w:t>
+        </w:r>
+      </w:ins>
+      <w:r>
+        <w:t xml:space="preserve">intellectual property </w:t>
+      </w:r>
+      <w:del w:id="211" w:author="Miriam Graham" w:date="2026-10-28T04:08:26Z">
+        <w:r>
+          <w:delText xml:space="preserve">infringement claims except where such claim arises from combination of TLG-800 assemblies with Buyer airframe hydraulic systems.</w:delText>
+        </w:r>
+      </w:del>
+      <w:ins w:id="212" w:author="Miriam Graham" w:date="2026-10-28T04:08:26Z">
+        <w:r>
+          <w:t xml:space="preserve">indemnification obligations (for which liability remains uncapped).</w:t>
         </w:r>
       </w:ins>
       <w:commentRangeEnd w:id="2"/>
       <w:r>
+        <w:rPr>
+          <w:rStyle w:val="CommentReference"/>
+        </w:rPr>
         <w:commentReference w:id="2"/>
       </w:r>
     </w:p>
@@ -420,7 +498,7 @@
     </w:p>
     <w:p>
       <w:r>
-        <w:t xml:space="preserve">28.1 (a) Governing Law &amp; Exclusive Venue: This Contract and all claims, controversies, or disputes arising hereunder shall be governed by and construed in accordance with the substantive laws of the State of Delaware, excluding its conflict of laws rules and excluding the United Nations Convention on Contracts for the International Sale of Goods (`CISG`). Exclusive judicial venue shall lie in the state or federal courts located in Wilmington, Delaware or King County, Washington. (b) Continuity of Flight-Critical Supply: Pending final resolution of any dispute, claim, or Change Order valuation, Seller shall proceed diligently with uninterrupted manufacture, testing, and delivery of all `FCC-900` flight control units in accordance with Buyer's production schedule.</w:t>
+        <w:t xml:space="preserve">28.1 This TLG-800 Subcontract and all disputes arising hereunder shall be governed by and construed in accordance with the laws of the State of Delaware, excluding its conflict of laws rules.</w:t>
       </w:r>
     </w:p>
     <w:p>
@@ -433,7 +511,7 @@
     </w:p>
     <w:p>
       <w:r>
-        <w:t xml:space="preserve">2.1 (a) Export Control Regulatory Compliance: Seller shall comply with all applicable U.S. export control laws and regulations, including the International Traffic in Arms Regulations (`ITAR`, 22 CFR Parts 120–130) and the Export Administration Regulations (`EAR`, 15 CFR Parts 730–774), covering dual-use flight control algorithms (`ECCN 7A994` / `7E994`) and defense technical data. (b) Export Classification &amp; Deemed Exports: Seller shall maintain active DDTC registration where applicable, furnish accurate ECCN/USML Commodity Jurisdiction classifications prior to first shipment, and prevent unauthorized deemed exports of Cymbal Aerospace technical data to foreign nationals without prior U.S. Department of State or Bureau of Industry and Security (`BIS`) authorization.</w:t>
+        <w:t xml:space="preserve">2.1 Seller shall comply with all applicable U.S. export control laws and regulations (ITAR and EAR) for all TLG-800 landing gear metallurgy and machining technical data.</w:t>
       </w:r>
     </w:p>
     <w:p>
@@ -447,10 +525,13 @@
     <w:p>
       <w:commentRangeStart w:id="3"/>
       <w:r>
-        <w:t xml:space="preserve">4.1 (a) Importer of Record: Seller shall act as Importer of Record for all imported titanium forgings. (b) Tariff Allocation: All unit prices in Schedule A are DDP Everett/Charleston facility. Any verified new Section 232/301 tariff increase exceeding 5.0% on aerospace titanium forgings shall be shared 50/50 between Buyer and Seller, strictly capped at a maximum aggregate adjustment of 2.0% ($1,040,000) of the GP1 §3.1 Firm-Fixed-Price SOW ceiling ($52,000,000).</w:t>
+        <w:t xml:space="preserve">4.1 (a) Importer of Record: Seller shall act as Importer of Record for all imported TLG-800 titanium forgings. (b) Tariff Allocation: All unit prices in Schedule A are DDP Everett/Charleston facility. Any verified new Section 232/301 tariff increase exceeding 5.0% on aerospace titanium forgings shall be shared 50/50 between Buyer and Seller, strictly capped at a maximum aggregate adjustment of 2.0% ($1,040,000) of the GP1 §3.1 Firm-Fixed-Price SOW ceiling ($52,000,000).</w:t>
       </w:r>
       <w:commentRangeEnd w:id="3"/>
       <w:r>
+        <w:rPr>
+          <w:rStyle w:val="CommentReference"/>
+        </w:rPr>
         <w:commentReference w:id="3"/>
       </w:r>
     </w:p>
@@ -465,10 +546,13 @@
     <w:p>
       <w:commentRangeStart w:id="4"/>
       <w:r>
-        <w:t xml:space="preserve">3.2 Cyber Incident Reporting &amp; Forensic Preservation (DFARS 252.204-7012): Seller shall report any suspected or confirmed cybersecurity incident affecting Covered Defense Information (CDI), flight-critical technical data, or development networks to Cymbal Aerospace CSOC and the DoD DIBNet portal within seventy-two (72) hours of discovery. Seller shall immediately isolate affected systems, preserve raw packet captures and forensic disk images for at least ninety (90) days, and provide Cymbal Aerospace cybersecurity investigators direct access to unredacted forensic logs upon request.</w:t>
+        <w:t xml:space="preserve">3.2 Seller shall maintain NIST SP 800-171 controls for all CNC 5-axis machining cells and report any cybersecurity incident affecting Covered Defense Information or TLG-800 technical data within seventy-two (72) hours of discovery, and provide forensic log images upon request.</w:t>
       </w:r>
       <w:commentRangeEnd w:id="4"/>
       <w:r>
+        <w:rPr>
+          <w:rStyle w:val="CommentReference"/>
+        </w:rPr>
         <w:commentReference w:id="4"/>
       </w:r>
     </w:p>
@@ -484,28 +568,28 @@
 
 <file path=word/comments.xml><?xml version="1.0" encoding="utf-8"?>
 <w:comments xmlns:w="http://schemas.openxmlformats.org/wordprocessingml/2006/main">
-  <w:comment w:id="1" w:author="Megan Bowen" w:date="2026-10-22T00:15:42Z">
+  <w:comment w:id="1" w:author="Megan Bowen" w:initials="MB" w:date="2026-10-28T04:08:26Z">
     <w:p>
       <w:r>
-        <w:t>Megan Bowen (Lead Airworthiness &amp; QA DER): Approved Hold Firm — 36-month warranty from aircraft delivery and unannounced FAA 14 CFR Part 21.140 source inspection are non-waivable for primary landing gear forgings.</w:t>
+        <w:t>Megan Bowen (Lead Airworthiness &amp; QA DER): Approved Hold Firm — 36-month warranty from aircraft delivery and unannounced FAA 14 CFR Part 21.140 source inspection are non-waivable for primary TLG-800 landing gear forgings.</w:t>
       </w:r>
     </w:p>
   </w:comment>
-  <w:comment w:id="2" w:author="Miriam Graham" w:date="2026-10-22T00:15:42Z">
+  <w:comment w:id="2" w:author="Miriam Graham" w:initials="MG" w:date="2026-10-28T04:08:26Z">
     <w:p>
       <w:r>
-        <w:t>Miriam Graham (VP Legal &amp; IP): Recommended Tier-1 Super-Cap (2.0x / $104M or 1.5x / $78M floor) with mandatory uncapped carveouts for IP indemnity and flight-safety AD recalls — ready for Contract Owner final sign-off.</w:t>
+        <w:t>Miriam Graham (VP Legal &amp; IP): Recommended Tier-1 Super-Cap (2.0x / $104,000,000 General Cap with 2.5x / $130,000,000 Super-Cap) with mandatory uncapped carveouts for IP indemnity and flight-safety AD recalls — ready for Contract Owner final sign-off.</w:t>
       </w:r>
     </w:p>
   </w:comment>
-  <w:comment w:id="3" w:author="Pradeep Gupta" w:date="2026-10-22T00:15:42Z">
+  <w:comment w:id="3" w:author="Pradeep Gupta" w:initials="PG" w:date="2026-10-28T04:08:26Z">
     <w:p>
       <w:r>
         <w:t>Pradeep Gupta (Director, Global Tax &amp; Trade): Approved Tier-1 50/50 tariff-sharing band above 5.0% threshold, strictly capped at +2.0% ($1,040,000) of the $52M Firm-Fixed-Price SOW.</w:t>
       </w:r>
     </w:p>
   </w:comment>
-  <w:comment w:id="4" w:author="Alex Wilber" w:date="2026-10-22T00:15:42Z">
+  <w:comment w:id="4" w:author="Alex Wilber" w:initials="AW" w:date="2026-10-28T04:08:26Z">
     <w:p>
       <w:r>
         <w:t>Alex Wilber (CISO Lead, Supplier Cyber Defense): Approved Hold Firm on mandatory 72-hour DFARS 252.204-7012 cyber incident reporting and 90-day raw forensic image preservation.</w:t>

</xml_diff>